<commit_message>
add variogram analysis + update accuracy
</commit_message>
<xml_diff>
--- a/Notes/CategoricalMetrices.docx
+++ b/Notes/CategoricalMetrices.docx
@@ -138,7 +138,7 @@
           <w:noProof/>
         </w:rPr>
         <w:drawing>
-          <wp:inline distT="0" distB="0" distL="0" distR="0" wp14:anchorId="43C701EF" wp14:editId="07EAF78C">
+          <wp:inline distT="0" distB="0" distL="0" distR="0" wp14:anchorId="43C701EF" wp14:editId="25BF790D">
             <wp:extent cx="66675" cy="66675"/>
             <wp:effectExtent l="0" t="0" r="9525" b="9525"/>
             <wp:docPr id="320512626" name="Picture 24" descr="LaTeX formula"/>
@@ -199,7 +199,7 @@
           <w:noProof/>
         </w:rPr>
         <w:drawing>
-          <wp:inline distT="0" distB="0" distL="0" distR="0" wp14:anchorId="44A208DD" wp14:editId="0BEFC1D0">
+          <wp:inline distT="0" distB="0" distL="0" distR="0" wp14:anchorId="44A208DD" wp14:editId="6C6CD1F4">
             <wp:extent cx="93519" cy="128588"/>
             <wp:effectExtent l="0" t="0" r="1905" b="5080"/>
             <wp:docPr id="1066082017" name="Picture 23" descr="LaTeX formula"/>
@@ -254,28 +254,17 @@
     <w:p>
       <w:pPr>
         <w:ind w:left="720" w:firstLine="720"/>
-      </w:pPr>
-      <w:r>
-        <w:t>Occurred</w:t>
-      </w:r>
-      <w:r>
-        <w:tab/>
-        <w:t>Didn’t Occur</w:t>
-      </w:r>
-    </w:p>
-    <w:p>
-      <w:r>
-        <w:t>Predicted</w:t>
-      </w:r>
-      <w:r>
-        <w:tab/>
-      </w:r>
-      <w:r>
         <w:rPr>
           <w:b/>
           <w:bCs/>
         </w:rPr>
-        <w:t>[a,</w:t>
+      </w:pPr>
+      <w:r>
+        <w:rPr>
+          <w:b/>
+          <w:bCs/>
+        </w:rPr>
+        <w:t>Occurred</w:t>
       </w:r>
       <w:r>
         <w:rPr>
@@ -283,75 +272,66 @@
           <w:bCs/>
         </w:rPr>
         <w:tab/>
-      </w:r>
+        <w:t>Didn’t Occur</w:t>
+      </w:r>
+    </w:p>
+    <w:p>
       <w:r>
         <w:rPr>
           <w:b/>
           <w:bCs/>
         </w:rPr>
+        <w:t>Predicted</w:t>
+      </w:r>
+      <w:r>
         <w:tab/>
       </w:r>
       <w:r>
+        <w:t>[a,</w:t>
+      </w:r>
+      <w:r>
+        <w:tab/>
+      </w:r>
+      <w:r>
+        <w:tab/>
+      </w:r>
+      <w:r>
+        <w:tab/>
+      </w:r>
+      <w:r>
+        <w:t>b]</w:t>
+      </w:r>
+    </w:p>
+    <w:p>
+      <w:pPr>
         <w:rPr>
           <w:b/>
           <w:bCs/>
         </w:rPr>
-        <w:tab/>
-      </w:r>
+      </w:pPr>
       <w:r>
         <w:rPr>
           <w:b/>
           <w:bCs/>
         </w:rPr>
-        <w:t>b]</w:t>
-      </w:r>
-    </w:p>
-    <w:p>
-      <w:pPr>
-        <w:rPr>
-          <w:b/>
-          <w:bCs/>
-        </w:rPr>
-      </w:pPr>
-      <w:r>
         <w:t>Didn’t Predict</w:t>
       </w:r>
       <w:r>
         <w:tab/>
       </w:r>
       <w:r>
-        <w:rPr>
-          <w:b/>
-          <w:bCs/>
-        </w:rPr>
         <w:t>[c,</w:t>
       </w:r>
       <w:r>
-        <w:rPr>
-          <w:b/>
-          <w:bCs/>
-        </w:rPr>
         <w:tab/>
       </w:r>
       <w:r>
-        <w:rPr>
-          <w:b/>
-          <w:bCs/>
-        </w:rPr>
         <w:tab/>
       </w:r>
       <w:r>
-        <w:rPr>
-          <w:b/>
-          <w:bCs/>
-        </w:rPr>
         <w:tab/>
       </w:r>
       <w:r>
-        <w:rPr>
-          <w:b/>
-          <w:bCs/>
-        </w:rPr>
         <w:t>d]</w:t>
       </w:r>
     </w:p>
@@ -538,7 +518,15 @@
         </w:rPr>
       </w:pPr>
       <w:r>
-        <w:t xml:space="preserve">Frequency Bias compares the total number of times an event was forecasted to the total number of times the event was actually observed. </w:t>
+        <w:t xml:space="preserve">Frequency Bias compares the total number of times an event was forecasted to the total number of times the event was </w:t>
+      </w:r>
+      <w:proofErr w:type="gramStart"/>
+      <w:r>
+        <w:t>actually observed</w:t>
+      </w:r>
+      <w:proofErr w:type="gramEnd"/>
+      <w:r>
+        <w:t xml:space="preserve">. </w:t>
       </w:r>
     </w:p>
     <w:p>

</xml_diff>